<commit_message>
feat: Add authentic resume PDF/DOCX downloads, YouTube playlists, and updated LinkedIn profile
</commit_message>
<xml_diff>
--- a/Harsh_Goyal_Resume.docx
+++ b/Harsh_Goyal_Resume.docx
@@ -12,7 +12,7 @@
           <w:rFonts w:ascii="Calibri" w:hAnsi="Calibri"/>
           <w:b/>
           <w:color w:val="1B365D"/>
-          <w:sz w:val="40"/>
+          <w:sz w:val="38"/>
         </w:rPr>
         <w:t>HARSH GOYAL</w:t>
       </w:r>
@@ -31,7 +31,7 @@
       <w:tr>
         <w:tc>
           <w:tcPr>
-            <w:tcW w:type="dxa" w:w="6048"/>
+            <w:tcW w:type="dxa" w:w="6192"/>
             <w:tcBorders>
               <w:top w:val="none"/>
               <w:left w:val="none"/>
@@ -59,14 +59,14 @@
                   <w:color w:val="0056B3"/>
                   <w:u w:val="single"/>
                 </w:rPr>
-                <w:t>https://www.linkedin.com/in/harshgoyal190720</w:t>
+                <w:t>https://www.linkedin.com/in/harshgoyalcodes/</w:t>
               </w:r>
             </w:hyperlink>
           </w:p>
         </w:tc>
         <w:tc>
           <w:tcPr>
-            <w:tcW w:type="dxa" w:w="4752"/>
+            <w:tcW w:type="dxa" w:w="4608"/>
             <w:tcBorders>
               <w:top w:val="none"/>
               <w:left w:val="none"/>
@@ -104,7 +104,7 @@
       <w:tr>
         <w:tc>
           <w:tcPr>
-            <w:tcW w:type="dxa" w:w="6048"/>
+            <w:tcW w:type="dxa" w:w="6192"/>
             <w:tcBorders>
               <w:top w:val="none"/>
               <w:left w:val="none"/>
@@ -114,7 +114,7 @@
           </w:tcPr>
           <w:p>
             <w:pPr>
-              <w:spacing w:before="0" w:after="80"/>
+              <w:spacing w:before="0" w:after="60"/>
             </w:pPr>
             <w:r>
               <w:rPr>
@@ -139,7 +139,7 @@
         </w:tc>
         <w:tc>
           <w:tcPr>
-            <w:tcW w:type="dxa" w:w="4752"/>
+            <w:tcW w:type="dxa" w:w="4608"/>
             <w:tcBorders>
               <w:top w:val="none"/>
               <w:left w:val="none"/>
@@ -149,7 +149,7 @@
           </w:tcPr>
           <w:p>
             <w:pPr>
-              <w:spacing w:before="0" w:after="80"/>
+              <w:spacing w:before="0" w:after="60"/>
               <w:jc w:val="right"/>
             </w:pPr>
             <w:r>
@@ -176,7 +176,7 @@
     <w:p>
       <w:pPr>
         <w:keepNext/>
-        <w:spacing w:before="120" w:after="60"/>
+        <w:spacing w:before="100" w:after="40"/>
         <w:pBdr>
           <w:bottom w:val="single" w:sz="8" w:space="2" w:color="1B365D"/>
         </w:pBdr>
@@ -186,21 +186,21 @@
           <w:rFonts w:ascii="Calibri" w:hAnsi="Calibri"/>
           <w:b/>
           <w:color w:val="1B365D"/>
-          <w:sz w:val="22"/>
+          <w:sz w:val="21"/>
         </w:rPr>
         <w:t>SKILLS</w:t>
       </w:r>
     </w:p>
     <w:p>
       <w:pPr>
-        <w:spacing w:before="0" w:after="30" w:line="252" w:lineRule="auto"/>
+        <w:spacing w:before="0" w:after="20" w:line="245" w:lineRule="auto"/>
         <w:ind w:left="288"/>
       </w:pPr>
       <w:r>
         <w:rPr>
           <w:rFonts w:ascii="Calibri" w:hAnsi="Calibri"/>
           <w:color w:val="111827"/>
-          <w:sz w:val="19"/>
+          <w:sz w:val="18"/>
         </w:rPr>
         <w:t xml:space="preserve">•  </w:t>
       </w:r>
@@ -209,7 +209,7 @@
           <w:rFonts w:ascii="Calibri" w:hAnsi="Calibri"/>
           <w:b/>
           <w:color w:val="111827"/>
-          <w:sz w:val="19"/>
+          <w:sz w:val="18"/>
         </w:rPr>
         <w:t xml:space="preserve">Languages:  </w:t>
       </w:r>
@@ -217,21 +217,21 @@
         <w:rPr>
           <w:rFonts w:ascii="Calibri" w:hAnsi="Calibri"/>
           <w:color w:val="111827"/>
-          <w:sz w:val="19"/>
+          <w:sz w:val="18"/>
         </w:rPr>
         <w:t>C, C++, Python, JavaScript, HTML, CSS, SQL</w:t>
       </w:r>
     </w:p>
     <w:p>
       <w:pPr>
-        <w:spacing w:before="0" w:after="30" w:line="252" w:lineRule="auto"/>
+        <w:spacing w:before="0" w:after="20" w:line="245" w:lineRule="auto"/>
         <w:ind w:left="288"/>
       </w:pPr>
       <w:r>
         <w:rPr>
           <w:rFonts w:ascii="Calibri" w:hAnsi="Calibri"/>
           <w:color w:val="111827"/>
-          <w:sz w:val="19"/>
+          <w:sz w:val="18"/>
         </w:rPr>
         <w:t xml:space="preserve">•  </w:t>
       </w:r>
@@ -240,7 +240,7 @@
           <w:rFonts w:ascii="Calibri" w:hAnsi="Calibri"/>
           <w:b/>
           <w:color w:val="111827"/>
-          <w:sz w:val="19"/>
+          <w:sz w:val="18"/>
         </w:rPr>
         <w:t xml:space="preserve">Technologies:  </w:t>
       </w:r>
@@ -248,21 +248,21 @@
         <w:rPr>
           <w:rFonts w:ascii="Calibri" w:hAnsi="Calibri"/>
           <w:color w:val="111827"/>
-          <w:sz w:val="19"/>
+          <w:sz w:val="18"/>
         </w:rPr>
         <w:t>React.js, Tailwind CSS, Google Authentication, Node.js fundamentals, Embedded C++, IoT</w:t>
       </w:r>
     </w:p>
     <w:p>
       <w:pPr>
-        <w:spacing w:before="0" w:after="30" w:line="252" w:lineRule="auto"/>
+        <w:spacing w:before="0" w:after="20" w:line="245" w:lineRule="auto"/>
         <w:ind w:left="288"/>
       </w:pPr>
       <w:r>
         <w:rPr>
           <w:rFonts w:ascii="Calibri" w:hAnsi="Calibri"/>
           <w:color w:val="111827"/>
-          <w:sz w:val="19"/>
+          <w:sz w:val="18"/>
         </w:rPr>
         <w:t xml:space="preserve">•  </w:t>
       </w:r>
@@ -271,7 +271,7 @@
           <w:rFonts w:ascii="Calibri" w:hAnsi="Calibri"/>
           <w:b/>
           <w:color w:val="111827"/>
-          <w:sz w:val="19"/>
+          <w:sz w:val="18"/>
         </w:rPr>
         <w:t xml:space="preserve">Databases/Tools:  </w:t>
       </w:r>
@@ -279,21 +279,21 @@
         <w:rPr>
           <w:rFonts w:ascii="Calibri" w:hAnsi="Calibri"/>
           <w:color w:val="111827"/>
-          <w:sz w:val="19"/>
+          <w:sz w:val="18"/>
         </w:rPr>
         <w:t>MySQL, Git, GitHub, VS Code, Arduino IDE, Notion, Figma</w:t>
       </w:r>
     </w:p>
     <w:p>
       <w:pPr>
-        <w:spacing w:before="0" w:after="30" w:line="252" w:lineRule="auto"/>
+        <w:spacing w:before="0" w:after="20" w:line="245" w:lineRule="auto"/>
         <w:ind w:left="288"/>
       </w:pPr>
       <w:r>
         <w:rPr>
           <w:rFonts w:ascii="Calibri" w:hAnsi="Calibri"/>
           <w:color w:val="111827"/>
-          <w:sz w:val="19"/>
+          <w:sz w:val="18"/>
         </w:rPr>
         <w:t xml:space="preserve">•  </w:t>
       </w:r>
@@ -302,7 +302,7 @@
           <w:rFonts w:ascii="Calibri" w:hAnsi="Calibri"/>
           <w:b/>
           <w:color w:val="111827"/>
-          <w:sz w:val="19"/>
+          <w:sz w:val="18"/>
         </w:rPr>
         <w:t xml:space="preserve">Soft Skills:  </w:t>
       </w:r>
@@ -310,7 +310,7 @@
         <w:rPr>
           <w:rFonts w:ascii="Calibri" w:hAnsi="Calibri"/>
           <w:color w:val="111827"/>
-          <w:sz w:val="19"/>
+          <w:sz w:val="18"/>
         </w:rPr>
         <w:t>Problem solving, Team collaboration, Technical mentorship, Content creation, Time management</w:t>
       </w:r>
@@ -318,7 +318,7 @@
     <w:p>
       <w:pPr>
         <w:keepNext/>
-        <w:spacing w:before="120" w:after="60"/>
+        <w:spacing w:before="100" w:after="40"/>
         <w:pBdr>
           <w:bottom w:val="single" w:sz="8" w:space="2" w:color="1B365D"/>
         </w:pBdr>
@@ -328,7 +328,7 @@
           <w:rFonts w:ascii="Calibri" w:hAnsi="Calibri"/>
           <w:b/>
           <w:color w:val="1B365D"/>
-          <w:sz w:val="22"/>
+          <w:sz w:val="21"/>
         </w:rPr>
         <w:t>PROJECTS</w:t>
       </w:r>
@@ -347,7 +347,7 @@
       <w:tr>
         <w:tc>
           <w:tcPr>
-            <w:tcW w:type="dxa" w:w="8064"/>
+            <w:tcW w:type="dxa" w:w="8208"/>
             <w:tcBorders>
               <w:top w:val="none"/>
               <w:left w:val="none"/>
@@ -357,14 +357,14 @@
           </w:tcPr>
           <w:p>
             <w:pPr>
-              <w:spacing w:before="60" w:after="20"/>
+              <w:spacing w:before="50" w:after="20"/>
             </w:pPr>
             <w:r>
               <w:rPr>
                 <w:rFonts w:ascii="Calibri" w:hAnsi="Calibri"/>
                 <w:b/>
                 <w:color w:val="1B365D"/>
-                <w:sz w:val="20"/>
+                <w:sz w:val="19"/>
               </w:rPr>
               <w:t>PlaceIQ (AI-Assisted Career Readiness Platform)</w:t>
             </w:r>
@@ -373,7 +373,7 @@
                 <w:rFonts w:ascii="Calibri" w:hAnsi="Calibri"/>
                 <w:b/>
                 <w:color w:val="111827"/>
-                <w:sz w:val="20"/>
+                <w:sz w:val="19"/>
               </w:rPr>
               <w:t xml:space="preserve"> | </w:t>
             </w:r>
@@ -391,7 +391,7 @@
         </w:tc>
         <w:tc>
           <w:tcPr>
-            <w:tcW w:type="dxa" w:w="2736"/>
+            <w:tcW w:type="dxa" w:w="2592"/>
             <w:tcBorders>
               <w:top w:val="none"/>
               <w:left w:val="none"/>
@@ -401,14 +401,14 @@
           </w:tcPr>
           <w:p>
             <w:pPr>
-              <w:spacing w:before="60" w:after="20"/>
+              <w:spacing w:before="50" w:after="20"/>
               <w:jc w:val="right"/>
             </w:pPr>
             <w:r>
               <w:rPr>
                 <w:rFonts w:ascii="Calibri" w:hAnsi="Calibri"/>
                 <w:color w:val="4B5563"/>
-                <w:sz w:val="19"/>
+                <w:sz w:val="18"/>
               </w:rPr>
               <w:t>May 2026 - Jun 2026</w:t>
             </w:r>
@@ -418,14 +418,14 @@
     </w:tbl>
     <w:p>
       <w:pPr>
-        <w:spacing w:before="0" w:after="30" w:line="252" w:lineRule="auto"/>
+        <w:spacing w:before="0" w:after="20" w:line="245" w:lineRule="auto"/>
         <w:ind w:left="288"/>
       </w:pPr>
       <w:r>
         <w:rPr>
           <w:rFonts w:ascii="Calibri" w:hAnsi="Calibri"/>
           <w:color w:val="111827"/>
-          <w:sz w:val="19"/>
+          <w:sz w:val="18"/>
         </w:rPr>
         <w:t xml:space="preserve">•  </w:t>
       </w:r>
@@ -434,7 +434,7 @@
           <w:rFonts w:ascii="Calibri" w:hAnsi="Calibri"/>
           <w:b/>
           <w:color w:val="111827"/>
-          <w:sz w:val="19"/>
+          <w:sz w:val="18"/>
         </w:rPr>
         <w:t xml:space="preserve">Built an AI-assisted career readiness platform </w:t>
       </w:r>
@@ -442,21 +442,21 @@
         <w:rPr>
           <w:rFonts w:ascii="Calibri" w:hAnsi="Calibri"/>
           <w:color w:val="111827"/>
-          <w:sz w:val="19"/>
+          <w:sz w:val="18"/>
         </w:rPr>
         <w:t>designed to evaluate student profiles against target company skill benchmarks.</w:t>
       </w:r>
     </w:p>
     <w:p>
       <w:pPr>
-        <w:spacing w:before="0" w:after="30" w:line="252" w:lineRule="auto"/>
+        <w:spacing w:before="0" w:after="20" w:line="245" w:lineRule="auto"/>
         <w:ind w:left="288"/>
       </w:pPr>
       <w:r>
         <w:rPr>
           <w:rFonts w:ascii="Calibri" w:hAnsi="Calibri"/>
           <w:color w:val="111827"/>
-          <w:sz w:val="19"/>
+          <w:sz w:val="18"/>
         </w:rPr>
         <w:t xml:space="preserve">•  </w:t>
       </w:r>
@@ -465,7 +465,7 @@
           <w:rFonts w:ascii="Calibri" w:hAnsi="Calibri"/>
           <w:b/>
           <w:color w:val="111827"/>
-          <w:sz w:val="19"/>
+          <w:sz w:val="18"/>
         </w:rPr>
         <w:t xml:space="preserve">Engineered automated resume parsing </w:t>
       </w:r>
@@ -473,21 +473,21 @@
         <w:rPr>
           <w:rFonts w:ascii="Calibri" w:hAnsi="Calibri"/>
           <w:color w:val="111827"/>
-          <w:sz w:val="19"/>
+          <w:sz w:val="18"/>
         </w:rPr>
         <w:t>and skill-gap analysis pipelines identifying core technical deficiencies prior to job applications.</w:t>
       </w:r>
     </w:p>
     <w:p>
       <w:pPr>
-        <w:spacing w:before="0" w:after="30" w:line="252" w:lineRule="auto"/>
+        <w:spacing w:before="0" w:after="20" w:line="245" w:lineRule="auto"/>
         <w:ind w:left="288"/>
       </w:pPr>
       <w:r>
         <w:rPr>
           <w:rFonts w:ascii="Calibri" w:hAnsi="Calibri"/>
           <w:color w:val="111827"/>
-          <w:sz w:val="19"/>
+          <w:sz w:val="18"/>
         </w:rPr>
         <w:t xml:space="preserve">•  </w:t>
       </w:r>
@@ -496,7 +496,7 @@
           <w:rFonts w:ascii="Calibri" w:hAnsi="Calibri"/>
           <w:b/>
           <w:color w:val="111827"/>
-          <w:sz w:val="19"/>
+          <w:sz w:val="18"/>
         </w:rPr>
         <w:t xml:space="preserve">Structured tailored 6-step interview pathways </w:t>
       </w:r>
@@ -504,21 +504,21 @@
         <w:rPr>
           <w:rFonts w:ascii="Calibri" w:hAnsi="Calibri"/>
           <w:color w:val="111827"/>
-          <w:sz w:val="19"/>
+          <w:sz w:val="18"/>
         </w:rPr>
         <w:t>integrating company-specific profile assessments and interactive mock evaluations.</w:t>
       </w:r>
     </w:p>
     <w:p>
       <w:pPr>
-        <w:spacing w:before="0" w:after="30" w:line="252" w:lineRule="auto"/>
+        <w:spacing w:before="0" w:after="20" w:line="245" w:lineRule="auto"/>
         <w:ind w:left="288"/>
       </w:pPr>
       <w:r>
         <w:rPr>
           <w:rFonts w:ascii="Calibri" w:hAnsi="Calibri"/>
           <w:color w:val="111827"/>
-          <w:sz w:val="19"/>
+          <w:sz w:val="18"/>
         </w:rPr>
         <w:t xml:space="preserve">•  </w:t>
       </w:r>
@@ -527,7 +527,7 @@
           <w:rFonts w:ascii="Calibri" w:hAnsi="Calibri"/>
           <w:b/>
           <w:color w:val="111827"/>
-          <w:sz w:val="19"/>
+          <w:sz w:val="18"/>
         </w:rPr>
         <w:t xml:space="preserve">Tech Stack: </w:t>
       </w:r>
@@ -535,7 +535,7 @@
         <w:rPr>
           <w:rFonts w:ascii="Calibri" w:hAnsi="Calibri"/>
           <w:color w:val="111827"/>
-          <w:sz w:val="19"/>
+          <w:sz w:val="18"/>
         </w:rPr>
         <w:t>Python, NLP, React.js, JavaScript, Tailwind CSS, REST APIs, Git</w:t>
       </w:r>
@@ -554,7 +554,7 @@
       <w:tr>
         <w:tc>
           <w:tcPr>
-            <w:tcW w:type="dxa" w:w="8064"/>
+            <w:tcW w:type="dxa" w:w="8208"/>
             <w:tcBorders>
               <w:top w:val="none"/>
               <w:left w:val="none"/>
@@ -564,23 +564,23 @@
           </w:tcPr>
           <w:p>
             <w:pPr>
-              <w:spacing w:before="60" w:after="20"/>
+              <w:spacing w:before="50" w:after="20"/>
             </w:pPr>
             <w:r>
               <w:rPr>
                 <w:rFonts w:ascii="Calibri" w:hAnsi="Calibri"/>
                 <w:b/>
                 <w:color w:val="1B365D"/>
-                <w:sz w:val="20"/>
+                <w:sz w:val="19"/>
               </w:rPr>
-              <w:t>3-Year Placement Roadmap for a B.Tech CSE Student</w:t>
+              <w:t>TGPA Calculator (Semester Academic Utility)</w:t>
             </w:r>
             <w:r>
               <w:rPr>
                 <w:rFonts w:ascii="Calibri" w:hAnsi="Calibri"/>
                 <w:b/>
                 <w:color w:val="111827"/>
-                <w:sz w:val="20"/>
+                <w:sz w:val="19"/>
               </w:rPr>
               <w:t xml:space="preserve"> | </w:t>
             </w:r>
@@ -598,7 +598,7 @@
         </w:tc>
         <w:tc>
           <w:tcPr>
-            <w:tcW w:type="dxa" w:w="2736"/>
+            <w:tcW w:type="dxa" w:w="2592"/>
             <w:tcBorders>
               <w:top w:val="none"/>
               <w:left w:val="none"/>
@@ -608,221 +608,14 @@
           </w:tcPr>
           <w:p>
             <w:pPr>
-              <w:spacing w:before="60" w:after="20"/>
+              <w:spacing w:before="50" w:after="20"/>
               <w:jc w:val="right"/>
             </w:pPr>
             <w:r>
               <w:rPr>
                 <w:rFonts w:ascii="Calibri" w:hAnsi="Calibri"/>
                 <w:color w:val="4B5563"/>
-                <w:sz w:val="19"/>
-              </w:rPr>
-              <w:t>Feb 2026 - Mar 2026</w:t>
-            </w:r>
-          </w:p>
-        </w:tc>
-      </w:tr>
-    </w:tbl>
-    <w:p>
-      <w:pPr>
-        <w:spacing w:before="0" w:after="30" w:line="252" w:lineRule="auto"/>
-        <w:ind w:left="288"/>
-      </w:pPr>
-      <w:r>
-        <w:rPr>
-          <w:rFonts w:ascii="Calibri" w:hAnsi="Calibri"/>
-          <w:color w:val="111827"/>
-          <w:sz w:val="19"/>
-        </w:rPr>
-        <w:t xml:space="preserve">•  </w:t>
-      </w:r>
-      <w:r>
-        <w:rPr>
-          <w:rFonts w:ascii="Calibri" w:hAnsi="Calibri"/>
-          <w:b/>
-          <w:color w:val="111827"/>
-          <w:sz w:val="19"/>
-        </w:rPr>
-        <w:t xml:space="preserve">Architected a multi-year engineering roadmap </w:t>
-      </w:r>
-      <w:r>
-        <w:rPr>
-          <w:rFonts w:ascii="Calibri" w:hAnsi="Calibri"/>
-          <w:color w:val="111827"/>
-          <w:sz w:val="19"/>
-        </w:rPr>
-        <w:t>blueprint guiding 100+ undergraduates through semester-wise milestones in DSA and Core CS.</w:t>
-      </w:r>
-    </w:p>
-    <w:p>
-      <w:pPr>
-        <w:spacing w:before="0" w:after="30" w:line="252" w:lineRule="auto"/>
-        <w:ind w:left="288"/>
-      </w:pPr>
-      <w:r>
-        <w:rPr>
-          <w:rFonts w:ascii="Calibri" w:hAnsi="Calibri"/>
-          <w:color w:val="111827"/>
-          <w:sz w:val="19"/>
-        </w:rPr>
-        <w:t xml:space="preserve">•  </w:t>
-      </w:r>
-      <w:r>
-        <w:rPr>
-          <w:rFonts w:ascii="Calibri" w:hAnsi="Calibri"/>
-          <w:b/>
-          <w:color w:val="111827"/>
-          <w:sz w:val="19"/>
-        </w:rPr>
-        <w:t xml:space="preserve">Curated comprehensive learning sheets </w:t>
-      </w:r>
-      <w:r>
-        <w:rPr>
-          <w:rFonts w:ascii="Calibri" w:hAnsi="Calibri"/>
-          <w:color w:val="111827"/>
-          <w:sz w:val="19"/>
-        </w:rPr>
-        <w:t>covering LeetCode patterns, Operating Systems, DBMS, Networks, and System Design.</w:t>
-      </w:r>
-    </w:p>
-    <w:p>
-      <w:pPr>
-        <w:spacing w:before="0" w:after="30" w:line="252" w:lineRule="auto"/>
-        <w:ind w:left="288"/>
-      </w:pPr>
-      <w:r>
-        <w:rPr>
-          <w:rFonts w:ascii="Calibri" w:hAnsi="Calibri"/>
-          <w:color w:val="111827"/>
-          <w:sz w:val="19"/>
-        </w:rPr>
-        <w:t xml:space="preserve">•  </w:t>
-      </w:r>
-      <w:r>
-        <w:rPr>
-          <w:rFonts w:ascii="Calibri" w:hAnsi="Calibri"/>
-          <w:b/>
-          <w:color w:val="111827"/>
-          <w:sz w:val="19"/>
-        </w:rPr>
-        <w:t xml:space="preserve">Developed open-source Notion workspaces </w:t>
-      </w:r>
-      <w:r>
-        <w:rPr>
-          <w:rFonts w:ascii="Calibri" w:hAnsi="Calibri"/>
-          <w:color w:val="111827"/>
-          <w:sz w:val="19"/>
-        </w:rPr>
-        <w:t>and documentation repositories, complementing video tutorials on the Harsh Codes YouTube channel.</w:t>
-      </w:r>
-    </w:p>
-    <w:p>
-      <w:pPr>
-        <w:spacing w:before="0" w:after="30" w:line="252" w:lineRule="auto"/>
-        <w:ind w:left="288"/>
-      </w:pPr>
-      <w:r>
-        <w:rPr>
-          <w:rFonts w:ascii="Calibri" w:hAnsi="Calibri"/>
-          <w:color w:val="111827"/>
-          <w:sz w:val="19"/>
-        </w:rPr>
-        <w:t xml:space="preserve">•  </w:t>
-      </w:r>
-      <w:r>
-        <w:rPr>
-          <w:rFonts w:ascii="Calibri" w:hAnsi="Calibri"/>
-          <w:b/>
-          <w:color w:val="111827"/>
-          <w:sz w:val="19"/>
-        </w:rPr>
-        <w:t xml:space="preserve">Tech Stack: </w:t>
-      </w:r>
-      <w:r>
-        <w:rPr>
-          <w:rFonts w:ascii="Calibri" w:hAnsi="Calibri"/>
-          <w:color w:val="111827"/>
-          <w:sz w:val="19"/>
-        </w:rPr>
-        <w:t>DSA Curriculum, Markdown, Notion API, Technical Documentation, GitHub</w:t>
-      </w:r>
-    </w:p>
-    <w:tbl>
-      <w:tblPr>
-        <w:tblW w:type="auto" w:w="0"/>
-        <w:jc w:val="left"/>
-        <w:tblLayout w:type="fixed"/>
-        <w:tblLook w:firstColumn="1" w:firstRow="1" w:lastColumn="0" w:lastRow="0" w:noHBand="0" w:noVBand="1" w:val="04A0"/>
-      </w:tblPr>
-      <w:tblGrid>
-        <w:gridCol w:w="5400"/>
-        <w:gridCol w:w="5400"/>
-      </w:tblGrid>
-      <w:tr>
-        <w:tc>
-          <w:tcPr>
-            <w:tcW w:type="dxa" w:w="8064"/>
-            <w:tcBorders>
-              <w:top w:val="none"/>
-              <w:left w:val="none"/>
-              <w:bottom w:val="none"/>
-              <w:right w:val="none"/>
-            </w:tcBorders>
-          </w:tcPr>
-          <w:p>
-            <w:pPr>
-              <w:spacing w:before="60" w:after="20"/>
-            </w:pPr>
-            <w:r>
-              <w:rPr>
-                <w:rFonts w:ascii="Calibri" w:hAnsi="Calibri"/>
-                <w:b/>
-                <w:color w:val="1B365D"/>
-                <w:sz w:val="20"/>
-              </w:rPr>
-              <w:t>TGPA Calculator (Semester Academic Utility)</w:t>
-            </w:r>
-            <w:r>
-              <w:rPr>
-                <w:rFonts w:ascii="Calibri" w:hAnsi="Calibri"/>
-                <w:b/>
-                <w:color w:val="111827"/>
-                <w:sz w:val="20"/>
-              </w:rPr>
-              <w:t xml:space="preserve"> | </w:t>
-            </w:r>
-            <w:hyperlink r:id="rId14" w:history="1">
-              <w:r>
-                <w:rPr>
-                  <w:rFonts w:ascii="Calibri" w:hAnsi="Calibri"/>
-                  <w:color w:val="0056B3"/>
-                  <w:u w:val="single"/>
-                </w:rPr>
-                <w:t>GitHub</w:t>
-              </w:r>
-            </w:hyperlink>
-          </w:p>
-        </w:tc>
-        <w:tc>
-          <w:tcPr>
-            <w:tcW w:type="dxa" w:w="2736"/>
-            <w:tcBorders>
-              <w:top w:val="none"/>
-              <w:left w:val="none"/>
-              <w:bottom w:val="none"/>
-              <w:right w:val="none"/>
-            </w:tcBorders>
-          </w:tcPr>
-          <w:p>
-            <w:pPr>
-              <w:spacing w:before="60" w:after="20"/>
-              <w:jc w:val="right"/>
-            </w:pPr>
-            <w:r>
-              <w:rPr>
-                <w:rFonts w:ascii="Calibri" w:hAnsi="Calibri"/>
-                <w:color w:val="4B5563"/>
-                <w:sz w:val="19"/>
+                <w:sz w:val="18"/>
               </w:rPr>
               <w:t>Dec 2025 - Jan 2026</w:t>
             </w:r>
@@ -832,14 +625,14 @@
     </w:tbl>
     <w:p>
       <w:pPr>
-        <w:spacing w:before="0" w:after="30" w:line="252" w:lineRule="auto"/>
+        <w:spacing w:before="0" w:after="20" w:line="245" w:lineRule="auto"/>
         <w:ind w:left="288"/>
       </w:pPr>
       <w:r>
         <w:rPr>
           <w:rFonts w:ascii="Calibri" w:hAnsi="Calibri"/>
           <w:color w:val="111827"/>
-          <w:sz w:val="19"/>
+          <w:sz w:val="18"/>
         </w:rPr>
         <w:t xml:space="preserve">•  </w:t>
       </w:r>
@@ -848,7 +641,7 @@
           <w:rFonts w:ascii="Calibri" w:hAnsi="Calibri"/>
           <w:b/>
           <w:color w:val="111827"/>
-          <w:sz w:val="19"/>
+          <w:sz w:val="18"/>
         </w:rPr>
         <w:t xml:space="preserve">Developed a responsive web application </w:t>
       </w:r>
@@ -856,21 +649,21 @@
         <w:rPr>
           <w:rFonts w:ascii="Calibri" w:hAnsi="Calibri"/>
           <w:color w:val="111827"/>
-          <w:sz w:val="19"/>
+          <w:sz w:val="18"/>
         </w:rPr>
         <w:t>enabling students to accurately calculate semester TGPA and projected CGPA metrics.</w:t>
       </w:r>
     </w:p>
     <w:p>
       <w:pPr>
-        <w:spacing w:before="0" w:after="30" w:line="252" w:lineRule="auto"/>
+        <w:spacing w:before="0" w:after="20" w:line="245" w:lineRule="auto"/>
         <w:ind w:left="288"/>
       </w:pPr>
       <w:r>
         <w:rPr>
           <w:rFonts w:ascii="Calibri" w:hAnsi="Calibri"/>
           <w:color w:val="111827"/>
-          <w:sz w:val="19"/>
+          <w:sz w:val="18"/>
         </w:rPr>
         <w:t xml:space="preserve">•  </w:t>
       </w:r>
@@ -879,7 +672,7 @@
           <w:rFonts w:ascii="Calibri" w:hAnsi="Calibri"/>
           <w:b/>
           <w:color w:val="111827"/>
-          <w:sz w:val="19"/>
+          <w:sz w:val="18"/>
         </w:rPr>
         <w:t xml:space="preserve">Integrated Google OAuth 2.0 authentication </w:t>
       </w:r>
@@ -887,21 +680,21 @@
         <w:rPr>
           <w:rFonts w:ascii="Calibri" w:hAnsi="Calibri"/>
           <w:color w:val="111827"/>
-          <w:sz w:val="19"/>
+          <w:sz w:val="18"/>
         </w:rPr>
         <w:t>allowing secure user login and persistent cloud/local grade record synchronization.</w:t>
       </w:r>
     </w:p>
     <w:p>
       <w:pPr>
-        <w:spacing w:before="0" w:after="30" w:line="252" w:lineRule="auto"/>
+        <w:spacing w:before="0" w:after="20" w:line="245" w:lineRule="auto"/>
         <w:ind w:left="288"/>
       </w:pPr>
       <w:r>
         <w:rPr>
           <w:rFonts w:ascii="Calibri" w:hAnsi="Calibri"/>
           <w:color w:val="111827"/>
-          <w:sz w:val="19"/>
+          <w:sz w:val="18"/>
         </w:rPr>
         <w:t xml:space="preserve">•  </w:t>
       </w:r>
@@ -910,7 +703,7 @@
           <w:rFonts w:ascii="Calibri" w:hAnsi="Calibri"/>
           <w:b/>
           <w:color w:val="111827"/>
-          <w:sz w:val="19"/>
+          <w:sz w:val="18"/>
         </w:rPr>
         <w:t xml:space="preserve">Designed dynamic credit-grade calculation algorithms </w:t>
       </w:r>
@@ -918,21 +711,21 @@
         <w:rPr>
           <w:rFonts w:ascii="Calibri" w:hAnsi="Calibri"/>
           <w:color w:val="111827"/>
-          <w:sz w:val="19"/>
+          <w:sz w:val="18"/>
         </w:rPr>
         <w:t>supporting various university grading scales and instant GPA projections.</w:t>
       </w:r>
     </w:p>
     <w:p>
       <w:pPr>
-        <w:spacing w:before="0" w:after="30" w:line="252" w:lineRule="auto"/>
+        <w:spacing w:before="0" w:after="20" w:line="245" w:lineRule="auto"/>
         <w:ind w:left="288"/>
       </w:pPr>
       <w:r>
         <w:rPr>
           <w:rFonts w:ascii="Calibri" w:hAnsi="Calibri"/>
           <w:color w:val="111827"/>
-          <w:sz w:val="19"/>
+          <w:sz w:val="18"/>
         </w:rPr>
         <w:t xml:space="preserve">•  </w:t>
       </w:r>
@@ -941,7 +734,7 @@
           <w:rFonts w:ascii="Calibri" w:hAnsi="Calibri"/>
           <w:b/>
           <w:color w:val="111827"/>
-          <w:sz w:val="19"/>
+          <w:sz w:val="18"/>
         </w:rPr>
         <w:t xml:space="preserve">Tech Stack: </w:t>
       </w:r>
@@ -949,7 +742,7 @@
         <w:rPr>
           <w:rFonts w:ascii="Calibri" w:hAnsi="Calibri"/>
           <w:color w:val="111827"/>
-          <w:sz w:val="19"/>
+          <w:sz w:val="18"/>
         </w:rPr>
         <w:t>React.js, JavaScript, Tailwind CSS, Google OAuth 2.0, HTML5, LocalStorage</w:t>
       </w:r>
@@ -968,7 +761,7 @@
       <w:tr>
         <w:tc>
           <w:tcPr>
-            <w:tcW w:type="dxa" w:w="8064"/>
+            <w:tcW w:type="dxa" w:w="8208"/>
             <w:tcBorders>
               <w:top w:val="none"/>
               <w:left w:val="none"/>
@@ -978,14 +771,14 @@
           </w:tcPr>
           <w:p>
             <w:pPr>
-              <w:spacing w:before="60" w:after="20"/>
+              <w:spacing w:before="50" w:after="20"/>
             </w:pPr>
             <w:r>
               <w:rPr>
                 <w:rFonts w:ascii="Calibri" w:hAnsi="Calibri"/>
                 <w:b/>
                 <w:color w:val="1B365D"/>
-                <w:sz w:val="20"/>
+                <w:sz w:val="19"/>
               </w:rPr>
               <w:t>Arduino Based Surveillance &amp; Monitoring System</w:t>
             </w:r>
@@ -994,11 +787,11 @@
                 <w:rFonts w:ascii="Calibri" w:hAnsi="Calibri"/>
                 <w:b/>
                 <w:color w:val="111827"/>
-                <w:sz w:val="20"/>
+                <w:sz w:val="19"/>
               </w:rPr>
               <w:t xml:space="preserve"> | </w:t>
             </w:r>
-            <w:hyperlink r:id="rId15" w:history="1">
+            <w:hyperlink r:id="rId14" w:history="1">
               <w:r>
                 <w:rPr>
                   <w:rFonts w:ascii="Calibri" w:hAnsi="Calibri"/>
@@ -1012,7 +805,7 @@
         </w:tc>
         <w:tc>
           <w:tcPr>
-            <w:tcW w:type="dxa" w:w="2736"/>
+            <w:tcW w:type="dxa" w:w="2592"/>
             <w:tcBorders>
               <w:top w:val="none"/>
               <w:left w:val="none"/>
@@ -1022,14 +815,14 @@
           </w:tcPr>
           <w:p>
             <w:pPr>
-              <w:spacing w:before="60" w:after="20"/>
+              <w:spacing w:before="50" w:after="20"/>
               <w:jc w:val="right"/>
             </w:pPr>
             <w:r>
               <w:rPr>
                 <w:rFonts w:ascii="Calibri" w:hAnsi="Calibri"/>
                 <w:color w:val="4B5563"/>
-                <w:sz w:val="19"/>
+                <w:sz w:val="18"/>
               </w:rPr>
               <w:t>Nov 2025 - Dec 2025</w:t>
             </w:r>
@@ -1039,14 +832,14 @@
     </w:tbl>
     <w:p>
       <w:pPr>
-        <w:spacing w:before="0" w:after="30" w:line="252" w:lineRule="auto"/>
+        <w:spacing w:before="0" w:after="20" w:line="245" w:lineRule="auto"/>
         <w:ind w:left="288"/>
       </w:pPr>
       <w:r>
         <w:rPr>
           <w:rFonts w:ascii="Calibri" w:hAnsi="Calibri"/>
           <w:color w:val="111827"/>
-          <w:sz w:val="19"/>
+          <w:sz w:val="18"/>
         </w:rPr>
         <w:t xml:space="preserve">•  </w:t>
       </w:r>
@@ -1055,7 +848,7 @@
           <w:rFonts w:ascii="Calibri" w:hAnsi="Calibri"/>
           <w:b/>
           <w:color w:val="111827"/>
-          <w:sz w:val="19"/>
+          <w:sz w:val="18"/>
         </w:rPr>
         <w:t xml:space="preserve">Engineered a compact embedded security system </w:t>
       </w:r>
@@ -1063,21 +856,21 @@
         <w:rPr>
           <w:rFonts w:ascii="Calibri" w:hAnsi="Calibri"/>
           <w:color w:val="111827"/>
-          <w:sz w:val="19"/>
+          <w:sz w:val="18"/>
         </w:rPr>
         <w:t>combining ultrasonic proximity detection and environmental monitoring with Arduino UNO.</w:t>
       </w:r>
     </w:p>
     <w:p>
       <w:pPr>
-        <w:spacing w:before="0" w:after="30" w:line="252" w:lineRule="auto"/>
+        <w:spacing w:before="0" w:after="20" w:line="245" w:lineRule="auto"/>
         <w:ind w:left="288"/>
       </w:pPr>
       <w:r>
         <w:rPr>
           <w:rFonts w:ascii="Calibri" w:hAnsi="Calibri"/>
           <w:color w:val="111827"/>
-          <w:sz w:val="19"/>
+          <w:sz w:val="18"/>
         </w:rPr>
         <w:t xml:space="preserve">•  </w:t>
       </w:r>
@@ -1086,7 +879,7 @@
           <w:rFonts w:ascii="Calibri" w:hAnsi="Calibri"/>
           <w:b/>
           <w:color w:val="111827"/>
-          <w:sz w:val="19"/>
+          <w:sz w:val="18"/>
         </w:rPr>
         <w:t xml:space="preserve">Integrated HC-SR04 SONAR (2–400cm range) </w:t>
       </w:r>
@@ -1094,21 +887,21 @@
         <w:rPr>
           <w:rFonts w:ascii="Calibri" w:hAnsi="Calibri"/>
           <w:color w:val="111827"/>
-          <w:sz w:val="19"/>
+          <w:sz w:val="18"/>
         </w:rPr>
         <w:t>and DHT11 temperature/humidity sensors with active buzzer alarm on Digital Pin 8 polling every 500ms.</w:t>
       </w:r>
     </w:p>
     <w:p>
       <w:pPr>
-        <w:spacing w:before="0" w:after="30" w:line="252" w:lineRule="auto"/>
+        <w:spacing w:before="0" w:after="20" w:line="245" w:lineRule="auto"/>
         <w:ind w:left="288"/>
       </w:pPr>
       <w:r>
         <w:rPr>
           <w:rFonts w:ascii="Calibri" w:hAnsi="Calibri"/>
           <w:color w:val="111827"/>
-          <w:sz w:val="19"/>
+          <w:sz w:val="18"/>
         </w:rPr>
         <w:t xml:space="preserve">•  </w:t>
       </w:r>
@@ -1117,7 +910,7 @@
           <w:rFonts w:ascii="Calibri" w:hAnsi="Calibri"/>
           <w:b/>
           <w:color w:val="111827"/>
-          <w:sz w:val="19"/>
+          <w:sz w:val="18"/>
         </w:rPr>
         <w:t xml:space="preserve">Implemented I2C 16x2 LCD display readouts </w:t>
       </w:r>
@@ -1125,21 +918,21 @@
         <w:rPr>
           <w:rFonts w:ascii="Calibri" w:hAnsi="Calibri"/>
           <w:color w:val="111827"/>
-          <w:sz w:val="19"/>
+          <w:sz w:val="18"/>
         </w:rPr>
         <w:t>at address 0x27, achieving 99% real-time threshold detection accuracy.</w:t>
       </w:r>
     </w:p>
     <w:p>
       <w:pPr>
-        <w:spacing w:before="0" w:after="30" w:line="252" w:lineRule="auto"/>
+        <w:spacing w:before="0" w:after="20" w:line="245" w:lineRule="auto"/>
         <w:ind w:left="288"/>
       </w:pPr>
       <w:r>
         <w:rPr>
           <w:rFonts w:ascii="Calibri" w:hAnsi="Calibri"/>
           <w:color w:val="111827"/>
-          <w:sz w:val="19"/>
+          <w:sz w:val="18"/>
         </w:rPr>
         <w:t xml:space="preserve">•  </w:t>
       </w:r>
@@ -1148,7 +941,7 @@
           <w:rFonts w:ascii="Calibri" w:hAnsi="Calibri"/>
           <w:b/>
           <w:color w:val="111827"/>
-          <w:sz w:val="19"/>
+          <w:sz w:val="18"/>
         </w:rPr>
         <w:t xml:space="preserve">Tech Stack: </w:t>
       </w:r>
@@ -1156,7 +949,7 @@
         <w:rPr>
           <w:rFonts w:ascii="Calibri" w:hAnsi="Calibri"/>
           <w:color w:val="111827"/>
-          <w:sz w:val="19"/>
+          <w:sz w:val="18"/>
         </w:rPr>
         <w:t>Arduino UNO, Embedded C++, HC-SR04 Ultrasonic Sensor, DHT11, I2C LCD, Active Buzzer</w:t>
       </w:r>
@@ -1164,7 +957,7 @@
     <w:p>
       <w:pPr>
         <w:keepNext/>
-        <w:spacing w:before="120" w:after="60"/>
+        <w:spacing w:before="100" w:after="40"/>
         <w:pBdr>
           <w:bottom w:val="single" w:sz="8" w:space="2" w:color="1B365D"/>
         </w:pBdr>
@@ -1174,265 +967,7 @@
           <w:rFonts w:ascii="Calibri" w:hAnsi="Calibri"/>
           <w:b/>
           <w:color w:val="1B365D"/>
-          <w:sz w:val="22"/>
-        </w:rPr>
-        <w:t>TRAINING</w:t>
-      </w:r>
-    </w:p>
-    <w:tbl>
-      <w:tblPr>
-        <w:tblW w:type="auto" w:w="0"/>
-        <w:jc w:val="left"/>
-        <w:tblLayout w:type="fixed"/>
-        <w:tblLook w:firstColumn="1" w:firstRow="1" w:lastColumn="0" w:lastRow="0" w:noHBand="0" w:noVBand="1" w:val="04A0"/>
-      </w:tblPr>
-      <w:tblGrid>
-        <w:gridCol w:w="5400"/>
-        <w:gridCol w:w="5400"/>
-      </w:tblGrid>
-      <w:tr>
-        <w:tc>
-          <w:tcPr>
-            <w:tcW w:type="dxa" w:w="8064"/>
-            <w:tcBorders>
-              <w:top w:val="none"/>
-              <w:left w:val="none"/>
-              <w:bottom w:val="none"/>
-              <w:right w:val="none"/>
-            </w:tcBorders>
-          </w:tcPr>
-          <w:p>
-            <w:pPr>
-              <w:spacing w:before="60" w:after="20"/>
-            </w:pPr>
-            <w:r>
-              <w:rPr>
-                <w:rFonts w:ascii="Calibri" w:hAnsi="Calibri"/>
-                <w:b/>
-                <w:color w:val="1B365D"/>
-                <w:sz w:val="20"/>
-              </w:rPr>
-              <w:t>Lovely Professional University | Certificate</w:t>
-            </w:r>
-            <w:r>
-              <w:rPr>
-                <w:rFonts w:ascii="Calibri" w:hAnsi="Calibri"/>
-                <w:b/>
-                <w:color w:val="111827"/>
-                <w:sz w:val="20"/>
-              </w:rPr>
-              <w:t xml:space="preserve"> | </w:t>
-            </w:r>
-            <w:hyperlink r:id="rId16" w:history="1">
-              <w:r>
-                <w:rPr>
-                  <w:rFonts w:ascii="Calibri" w:hAnsi="Calibri"/>
-                  <w:color w:val="0056B3"/>
-                  <w:u w:val="single"/>
-                </w:rPr>
-                <w:t>Verify</w:t>
-              </w:r>
-            </w:hyperlink>
-          </w:p>
-        </w:tc>
-        <w:tc>
-          <w:tcPr>
-            <w:tcW w:type="dxa" w:w="2736"/>
-            <w:tcBorders>
-              <w:top w:val="none"/>
-              <w:left w:val="none"/>
-              <w:bottom w:val="none"/>
-              <w:right w:val="none"/>
-            </w:tcBorders>
-          </w:tcPr>
-          <w:p>
-            <w:pPr>
-              <w:spacing w:before="60" w:after="20"/>
-              <w:jc w:val="right"/>
-            </w:pPr>
-            <w:r>
-              <w:rPr>
-                <w:rFonts w:ascii="Calibri" w:hAnsi="Calibri"/>
-                <w:color w:val="4B5563"/>
-                <w:sz w:val="19"/>
-              </w:rPr>
-              <w:t>Jun 2025 - Jul 2025</w:t>
-            </w:r>
-          </w:p>
-        </w:tc>
-      </w:tr>
-    </w:tbl>
-    <w:p>
-      <w:pPr>
-        <w:spacing w:before="0" w:after="20"/>
-      </w:pPr>
-      <w:r>
-        <w:rPr>
-          <w:rFonts w:ascii="Calibri" w:hAnsi="Calibri"/>
-          <w:b/>
-          <w:color w:val="111827"/>
-          <w:sz w:val="19"/>
-        </w:rPr>
-        <w:t xml:space="preserve">Design Thinking and Innovation </w:t>
-      </w:r>
-      <w:r>
-        <w:rPr>
-          <w:rFonts w:ascii="Calibri" w:hAnsi="Calibri"/>
-          <w:i/>
-          <w:color w:val="4B5563"/>
-          <w:sz w:val="18"/>
-        </w:rPr>
-        <w:t>— Authorized by IIT Bombay &amp; Offered via Coursera</w:t>
-        <w:br/>
-      </w:r>
-      <w:r>
-        <w:rPr>
-          <w:rFonts w:ascii="Calibri" w:hAnsi="Calibri"/>
-          <w:b/>
-          <w:color w:val="111827"/>
-          <w:sz w:val="19"/>
-        </w:rPr>
-        <w:t>Design Thinking Trainee &amp; Innovation Researcher</w:t>
-      </w:r>
-    </w:p>
-    <w:p>
-      <w:pPr>
-        <w:spacing w:before="0" w:after="30" w:line="252" w:lineRule="auto"/>
-        <w:ind w:left="288"/>
-      </w:pPr>
-      <w:r>
-        <w:rPr>
-          <w:rFonts w:ascii="Calibri" w:hAnsi="Calibri"/>
-          <w:color w:val="111827"/>
-          <w:sz w:val="19"/>
-        </w:rPr>
-        <w:t xml:space="preserve">•  </w:t>
-      </w:r>
-      <w:r>
-        <w:rPr>
-          <w:rFonts w:ascii="Calibri" w:hAnsi="Calibri"/>
-          <w:b/>
-          <w:color w:val="111827"/>
-          <w:sz w:val="19"/>
-        </w:rPr>
-        <w:t xml:space="preserve">Learned human-centered design methodologies </w:t>
-      </w:r>
-      <w:r>
-        <w:rPr>
-          <w:rFonts w:ascii="Calibri" w:hAnsi="Calibri"/>
-          <w:color w:val="111827"/>
-          <w:sz w:val="19"/>
-        </w:rPr>
-        <w:t>to analyze user pain points and formulate effective, user-centered solutions.</w:t>
-      </w:r>
-    </w:p>
-    <w:p>
-      <w:pPr>
-        <w:spacing w:before="0" w:after="30" w:line="252" w:lineRule="auto"/>
-        <w:ind w:left="288"/>
-      </w:pPr>
-      <w:r>
-        <w:rPr>
-          <w:rFonts w:ascii="Calibri" w:hAnsi="Calibri"/>
-          <w:color w:val="111827"/>
-          <w:sz w:val="19"/>
-        </w:rPr>
-        <w:t xml:space="preserve">•  </w:t>
-      </w:r>
-      <w:r>
-        <w:rPr>
-          <w:rFonts w:ascii="Calibri" w:hAnsi="Calibri"/>
-          <w:b/>
-          <w:color w:val="111827"/>
-          <w:sz w:val="19"/>
-        </w:rPr>
-        <w:t xml:space="preserve">Completed an end-to-end design lifecycle </w:t>
-      </w:r>
-      <w:r>
-        <w:rPr>
-          <w:rFonts w:ascii="Calibri" w:hAnsi="Calibri"/>
-          <w:color w:val="111827"/>
-          <w:sz w:val="19"/>
-        </w:rPr>
-        <w:t>covering empathize, define, ideate, prototype, and usability evaluation phases.</w:t>
-      </w:r>
-    </w:p>
-    <w:p>
-      <w:pPr>
-        <w:spacing w:before="0" w:after="30" w:line="252" w:lineRule="auto"/>
-        <w:ind w:left="288"/>
-      </w:pPr>
-      <w:r>
-        <w:rPr>
-          <w:rFonts w:ascii="Calibri" w:hAnsi="Calibri"/>
-          <w:color w:val="111827"/>
-          <w:sz w:val="19"/>
-        </w:rPr>
-        <w:t xml:space="preserve">•  </w:t>
-      </w:r>
-      <w:r>
-        <w:rPr>
-          <w:rFonts w:ascii="Calibri" w:hAnsi="Calibri"/>
-          <w:b/>
-          <w:color w:val="111827"/>
-          <w:sz w:val="19"/>
-        </w:rPr>
-        <w:t xml:space="preserve">Conducted user research activities </w:t>
-      </w:r>
-      <w:r>
-        <w:rPr>
-          <w:rFonts w:ascii="Calibri" w:hAnsi="Calibri"/>
-          <w:color w:val="111827"/>
-          <w:sz w:val="19"/>
-        </w:rPr>
-        <w:t>and translated key observations into actionable technical and UI/UX design requirements.</w:t>
-      </w:r>
-    </w:p>
-    <w:p>
-      <w:pPr>
-        <w:spacing w:before="0" w:after="30" w:line="252" w:lineRule="auto"/>
-        <w:ind w:left="288"/>
-      </w:pPr>
-      <w:r>
-        <w:rPr>
-          <w:rFonts w:ascii="Calibri" w:hAnsi="Calibri"/>
-          <w:color w:val="111827"/>
-          <w:sz w:val="19"/>
-        </w:rPr>
-        <w:t xml:space="preserve">•  </w:t>
-      </w:r>
-      <w:r>
-        <w:rPr>
-          <w:rFonts w:ascii="Calibri" w:hAnsi="Calibri"/>
-          <w:b/>
-          <w:color w:val="111827"/>
-          <w:sz w:val="19"/>
-        </w:rPr>
-        <w:t xml:space="preserve">Certified by Prof. B.K. Chakravarthy </w:t>
-      </w:r>
-      <w:r>
-        <w:rPr>
-          <w:rFonts w:ascii="Calibri" w:hAnsi="Calibri"/>
-          <w:color w:val="111827"/>
-          <w:sz w:val="19"/>
-        </w:rPr>
-        <w:t>and Prof. Usha Ananthakumar, Dean of Educational Outreach, IIT Bombay (ID: YTSDE176LDG5).</w:t>
-      </w:r>
-    </w:p>
-    <w:p>
-      <w:pPr>
-        <w:keepNext/>
-        <w:spacing w:before="120" w:after="60"/>
-        <w:pBdr>
-          <w:bottom w:val="single" w:sz="8" w:space="2" w:color="1B365D"/>
-        </w:pBdr>
-      </w:pPr>
-      <w:r>
-        <w:rPr>
-          <w:rFonts w:ascii="Calibri" w:hAnsi="Calibri"/>
-          <w:b/>
-          <w:color w:val="1B365D"/>
-          <w:sz w:val="22"/>
+          <w:sz w:val="21"/>
         </w:rPr>
         <w:t>CERTIFICATES</w:t>
       </w:r>
@@ -1451,7 +986,7 @@
       <w:tr>
         <w:tc>
           <w:tcPr>
-            <w:tcW w:type="dxa" w:w="8640"/>
+            <w:tcW w:type="dxa" w:w="8784"/>
             <w:tcBorders>
               <w:top w:val="none"/>
               <w:left w:val="none"/>
@@ -1461,12 +996,12 @@
           </w:tcPr>
           <w:p>
             <w:pPr>
-              <w:spacing w:before="0" w:after="30"/>
+              <w:spacing w:before="0" w:after="20"/>
             </w:pPr>
             <w:r>
               <w:rPr>
                 <w:rFonts w:ascii="Calibri" w:hAnsi="Calibri"/>
-                <w:sz w:val="19"/>
+                <w:sz w:val="18"/>
               </w:rPr>
               <w:t xml:space="preserve">•  </w:t>
             </w:r>
@@ -1475,7 +1010,7 @@
                 <w:rFonts w:ascii="Calibri" w:hAnsi="Calibri"/>
                 <w:b/>
                 <w:color w:val="111827"/>
-                <w:sz w:val="19"/>
+                <w:sz w:val="18"/>
               </w:rPr>
               <w:t xml:space="preserve">Programming Fundamentals using Python - Part 2 | </w:t>
             </w:r>
@@ -1483,7 +1018,7 @@
               <w:rPr>
                 <w:rFonts w:ascii="Calibri" w:hAnsi="Calibri"/>
                 <w:color w:val="1B365D"/>
-                <w:sz w:val="19"/>
+                <w:sz w:val="18"/>
               </w:rPr>
               <w:t>Infosys Springboard</w:t>
             </w:r>
@@ -1491,7 +1026,7 @@
         </w:tc>
         <w:tc>
           <w:tcPr>
-            <w:tcW w:type="dxa" w:w="2160"/>
+            <w:tcW w:type="dxa" w:w="2016"/>
             <w:tcBorders>
               <w:top w:val="none"/>
               <w:left w:val="none"/>
@@ -1501,14 +1036,14 @@
           </w:tcPr>
           <w:p>
             <w:pPr>
-              <w:spacing w:before="0" w:after="30"/>
+              <w:spacing w:before="0" w:after="20"/>
               <w:jc w:val="right"/>
             </w:pPr>
             <w:r>
               <w:rPr>
                 <w:rFonts w:ascii="Calibri" w:hAnsi="Calibri"/>
                 <w:color w:val="4B5563"/>
-                <w:sz w:val="19"/>
+                <w:sz w:val="18"/>
               </w:rPr>
               <w:t>Jul 2026</w:t>
             </w:r>
@@ -1530,7 +1065,7 @@
       <w:tr>
         <w:tc>
           <w:tcPr>
-            <w:tcW w:type="dxa" w:w="8640"/>
+            <w:tcW w:type="dxa" w:w="8784"/>
             <w:tcBorders>
               <w:top w:val="none"/>
               <w:left w:val="none"/>
@@ -1540,12 +1075,12 @@
           </w:tcPr>
           <w:p>
             <w:pPr>
-              <w:spacing w:before="0" w:after="30"/>
+              <w:spacing w:before="0" w:after="20"/>
             </w:pPr>
             <w:r>
               <w:rPr>
                 <w:rFonts w:ascii="Calibri" w:hAnsi="Calibri"/>
-                <w:sz w:val="19"/>
+                <w:sz w:val="18"/>
               </w:rPr>
               <w:t xml:space="preserve">•  </w:t>
             </w:r>
@@ -1554,15 +1089,15 @@
                 <w:rFonts w:ascii="Calibri" w:hAnsi="Calibri"/>
                 <w:b/>
                 <w:color w:val="111827"/>
-                <w:sz w:val="19"/>
+                <w:sz w:val="18"/>
               </w:rPr>
-              <w:t xml:space="preserve">Design Thinking and Innovation (Credential: YTSDE176LDG5) | </w:t>
+              <w:t xml:space="preserve">Design Thinking and Innovation | </w:t>
             </w:r>
             <w:r>
               <w:rPr>
                 <w:rFonts w:ascii="Calibri" w:hAnsi="Calibri"/>
                 <w:color w:val="1B365D"/>
-                <w:sz w:val="19"/>
+                <w:sz w:val="18"/>
               </w:rPr>
               <w:t>IIT Bombay &amp; Coursera</w:t>
             </w:r>
@@ -1570,7 +1105,7 @@
         </w:tc>
         <w:tc>
           <w:tcPr>
-            <w:tcW w:type="dxa" w:w="2160"/>
+            <w:tcW w:type="dxa" w:w="2016"/>
             <w:tcBorders>
               <w:top w:val="none"/>
               <w:left w:val="none"/>
@@ -1580,14 +1115,14 @@
           </w:tcPr>
           <w:p>
             <w:pPr>
-              <w:spacing w:before="0" w:after="30"/>
+              <w:spacing w:before="0" w:after="20"/>
               <w:jc w:val="right"/>
             </w:pPr>
             <w:r>
               <w:rPr>
                 <w:rFonts w:ascii="Calibri" w:hAnsi="Calibri"/>
                 <w:color w:val="4B5563"/>
-                <w:sz w:val="19"/>
+                <w:sz w:val="18"/>
               </w:rPr>
               <w:t>Jul 2026</w:t>
             </w:r>
@@ -1609,7 +1144,7 @@
       <w:tr>
         <w:tc>
           <w:tcPr>
-            <w:tcW w:type="dxa" w:w="8640"/>
+            <w:tcW w:type="dxa" w:w="8784"/>
             <w:tcBorders>
               <w:top w:val="none"/>
               <w:left w:val="none"/>
@@ -1619,12 +1154,12 @@
           </w:tcPr>
           <w:p>
             <w:pPr>
-              <w:spacing w:before="0" w:after="30"/>
+              <w:spacing w:before="0" w:after="20"/>
             </w:pPr>
             <w:r>
               <w:rPr>
                 <w:rFonts w:ascii="Calibri" w:hAnsi="Calibri"/>
-                <w:sz w:val="19"/>
+                <w:sz w:val="18"/>
               </w:rPr>
               <w:t xml:space="preserve">•  </w:t>
             </w:r>
@@ -1633,7 +1168,7 @@
                 <w:rFonts w:ascii="Calibri" w:hAnsi="Calibri"/>
                 <w:b/>
                 <w:color w:val="111827"/>
-                <w:sz w:val="19"/>
+                <w:sz w:val="18"/>
               </w:rPr>
               <w:t xml:space="preserve">Computer Programming in C (150 Hours Course Duration) | </w:t>
             </w:r>
@@ -1641,7 +1176,7 @@
               <w:rPr>
                 <w:rFonts w:ascii="Calibri" w:hAnsi="Calibri"/>
                 <w:color w:val="1B365D"/>
-                <w:sz w:val="19"/>
+                <w:sz w:val="18"/>
               </w:rPr>
               <w:t>NeoColab • iamneo &amp; LPU</w:t>
             </w:r>
@@ -1649,7 +1184,7 @@
         </w:tc>
         <w:tc>
           <w:tcPr>
-            <w:tcW w:type="dxa" w:w="2160"/>
+            <w:tcW w:type="dxa" w:w="2016"/>
             <w:tcBorders>
               <w:top w:val="none"/>
               <w:left w:val="none"/>
@@ -1659,14 +1194,14 @@
           </w:tcPr>
           <w:p>
             <w:pPr>
-              <w:spacing w:before="0" w:after="30"/>
+              <w:spacing w:before="0" w:after="20"/>
               <w:jc w:val="right"/>
             </w:pPr>
             <w:r>
               <w:rPr>
                 <w:rFonts w:ascii="Calibri" w:hAnsi="Calibri"/>
                 <w:color w:val="4B5563"/>
-                <w:sz w:val="19"/>
+                <w:sz w:val="18"/>
               </w:rPr>
               <w:t>May 2026</w:t>
             </w:r>
@@ -1688,7 +1223,7 @@
       <w:tr>
         <w:tc>
           <w:tcPr>
-            <w:tcW w:type="dxa" w:w="8640"/>
+            <w:tcW w:type="dxa" w:w="8784"/>
             <w:tcBorders>
               <w:top w:val="none"/>
               <w:left w:val="none"/>
@@ -1698,12 +1233,12 @@
           </w:tcPr>
           <w:p>
             <w:pPr>
-              <w:spacing w:before="0" w:after="30"/>
+              <w:spacing w:before="0" w:after="20"/>
             </w:pPr>
             <w:r>
               <w:rPr>
                 <w:rFonts w:ascii="Calibri" w:hAnsi="Calibri"/>
-                <w:sz w:val="19"/>
+                <w:sz w:val="18"/>
               </w:rPr>
               <w:t xml:space="preserve">•  </w:t>
             </w:r>
@@ -1712,15 +1247,15 @@
                 <w:rFonts w:ascii="Calibri" w:hAnsi="Calibri"/>
                 <w:b/>
                 <w:color w:val="111827"/>
-                <w:sz w:val="19"/>
+                <w:sz w:val="18"/>
               </w:rPr>
-              <w:t xml:space="preserve">ESL002: Intermediate English as a Second Language (Grade: 81.48%) | </w:t>
+              <w:t xml:space="preserve">ESL002: Intermediate English as a Second Language | </w:t>
             </w:r>
             <w:r>
               <w:rPr>
                 <w:rFonts w:ascii="Calibri" w:hAnsi="Calibri"/>
                 <w:color w:val="1B365D"/>
-                <w:sz w:val="19"/>
+                <w:sz w:val="18"/>
               </w:rPr>
               <w:t>Saylor Academy</w:t>
             </w:r>
@@ -1728,7 +1263,7 @@
         </w:tc>
         <w:tc>
           <w:tcPr>
-            <w:tcW w:type="dxa" w:w="2160"/>
+            <w:tcW w:type="dxa" w:w="2016"/>
             <w:tcBorders>
               <w:top w:val="none"/>
               <w:left w:val="none"/>
@@ -1738,14 +1273,14 @@
           </w:tcPr>
           <w:p>
             <w:pPr>
-              <w:spacing w:before="0" w:after="30"/>
+              <w:spacing w:before="0" w:after="20"/>
               <w:jc w:val="right"/>
             </w:pPr>
             <w:r>
               <w:rPr>
                 <w:rFonts w:ascii="Calibri" w:hAnsi="Calibri"/>
                 <w:color w:val="4B5563"/>
-                <w:sz w:val="19"/>
+                <w:sz w:val="18"/>
               </w:rPr>
               <w:t>Jan 2026</w:t>
             </w:r>
@@ -1756,7 +1291,7 @@
     <w:p>
       <w:pPr>
         <w:keepNext/>
-        <w:spacing w:before="120" w:after="60"/>
+        <w:spacing w:before="100" w:after="40"/>
         <w:pBdr>
           <w:bottom w:val="single" w:sz="8" w:space="2" w:color="1B365D"/>
         </w:pBdr>
@@ -1766,21 +1301,21 @@
           <w:rFonts w:ascii="Calibri" w:hAnsi="Calibri"/>
           <w:b/>
           <w:color w:val="1B365D"/>
-          <w:sz w:val="22"/>
+          <w:sz w:val="21"/>
         </w:rPr>
         <w:t>ACHIEVEMENTS</w:t>
       </w:r>
     </w:p>
     <w:p>
       <w:pPr>
-        <w:spacing w:before="0" w:after="30" w:line="252" w:lineRule="auto"/>
+        <w:spacing w:before="0" w:after="20" w:line="245" w:lineRule="auto"/>
         <w:ind w:left="288"/>
       </w:pPr>
       <w:r>
         <w:rPr>
           <w:rFonts w:ascii="Calibri" w:hAnsi="Calibri"/>
           <w:color w:val="111827"/>
-          <w:sz w:val="19"/>
+          <w:sz w:val="18"/>
         </w:rPr>
         <w:t xml:space="preserve">•  </w:t>
       </w:r>
@@ -1789,7 +1324,7 @@
           <w:rFonts w:ascii="Calibri" w:hAnsi="Calibri"/>
           <w:b/>
           <w:color w:val="111827"/>
-          <w:sz w:val="19"/>
+          <w:sz w:val="18"/>
         </w:rPr>
         <w:t xml:space="preserve">Academic Distinction: </w:t>
       </w:r>
@@ -1797,21 +1332,21 @@
         <w:rPr>
           <w:rFonts w:ascii="Calibri" w:hAnsi="Calibri"/>
           <w:color w:val="111827"/>
-          <w:sz w:val="19"/>
+          <w:sz w:val="18"/>
         </w:rPr>
         <w:t>Maintained a top-tier CGPA of 9.31 in B.Tech Computer Science &amp; Engineering at LPU.</w:t>
       </w:r>
     </w:p>
     <w:p>
       <w:pPr>
-        <w:spacing w:before="0" w:after="30" w:line="252" w:lineRule="auto"/>
+        <w:spacing w:before="0" w:after="20" w:line="245" w:lineRule="auto"/>
         <w:ind w:left="288"/>
       </w:pPr>
       <w:r>
         <w:rPr>
           <w:rFonts w:ascii="Calibri" w:hAnsi="Calibri"/>
           <w:color w:val="111827"/>
-          <w:sz w:val="19"/>
+          <w:sz w:val="18"/>
         </w:rPr>
         <w:t xml:space="preserve">•  </w:t>
       </w:r>
@@ -1820,7 +1355,7 @@
           <w:rFonts w:ascii="Calibri" w:hAnsi="Calibri"/>
           <w:b/>
           <w:color w:val="111827"/>
-          <w:sz w:val="19"/>
+          <w:sz w:val="18"/>
         </w:rPr>
         <w:t xml:space="preserve">Technical Content Creator: </w:t>
       </w:r>
@@ -1828,21 +1363,21 @@
         <w:rPr>
           <w:rFonts w:ascii="Calibri" w:hAnsi="Calibri"/>
           <w:color w:val="111827"/>
-          <w:sz w:val="19"/>
+          <w:sz w:val="18"/>
         </w:rPr>
         <w:t>Founded Harsh Codes YouTube channel; authored Python 21-Day Bootcamp &amp; CSE Placement Guides.</w:t>
       </w:r>
     </w:p>
     <w:p>
       <w:pPr>
-        <w:spacing w:before="0" w:after="30" w:line="252" w:lineRule="auto"/>
+        <w:spacing w:before="0" w:after="20" w:line="245" w:lineRule="auto"/>
         <w:ind w:left="288"/>
       </w:pPr>
       <w:r>
         <w:rPr>
           <w:rFonts w:ascii="Calibri" w:hAnsi="Calibri"/>
           <w:color w:val="111827"/>
-          <w:sz w:val="19"/>
+          <w:sz w:val="18"/>
         </w:rPr>
         <w:t xml:space="preserve">•  </w:t>
       </w:r>
@@ -1851,7 +1386,7 @@
           <w:rFonts w:ascii="Calibri" w:hAnsi="Calibri"/>
           <w:b/>
           <w:color w:val="111827"/>
-          <w:sz w:val="19"/>
+          <w:sz w:val="18"/>
         </w:rPr>
         <w:t xml:space="preserve">Rigorous Problem Solving: </w:t>
       </w:r>
@@ -1859,21 +1394,21 @@
         <w:rPr>
           <w:rFonts w:ascii="Calibri" w:hAnsi="Calibri"/>
           <w:color w:val="111827"/>
-          <w:sz w:val="19"/>
+          <w:sz w:val="18"/>
         </w:rPr>
         <w:t>Completed 150+ hours of structured programming in C, C++, and Python.</w:t>
       </w:r>
     </w:p>
     <w:p>
       <w:pPr>
-        <w:spacing w:before="0" w:after="30" w:line="252" w:lineRule="auto"/>
+        <w:spacing w:before="0" w:after="20" w:line="245" w:lineRule="auto"/>
         <w:ind w:left="288"/>
       </w:pPr>
       <w:r>
         <w:rPr>
           <w:rFonts w:ascii="Calibri" w:hAnsi="Calibri"/>
           <w:color w:val="111827"/>
-          <w:sz w:val="19"/>
+          <w:sz w:val="18"/>
         </w:rPr>
         <w:t xml:space="preserve">•  </w:t>
       </w:r>
@@ -1882,7 +1417,7 @@
           <w:rFonts w:ascii="Calibri" w:hAnsi="Calibri"/>
           <w:b/>
           <w:color w:val="111827"/>
-          <w:sz w:val="19"/>
+          <w:sz w:val="18"/>
         </w:rPr>
         <w:t xml:space="preserve">Hands-on Engineering: </w:t>
       </w:r>
@@ -1890,7 +1425,7 @@
         <w:rPr>
           <w:rFonts w:ascii="Calibri" w:hAnsi="Calibri"/>
           <w:color w:val="111827"/>
-          <w:sz w:val="19"/>
+          <w:sz w:val="18"/>
         </w:rPr>
         <w:t>Architected 5+ full-stack, AI, and IoT hardware projects independently.</w:t>
       </w:r>
@@ -1898,7 +1433,7 @@
     <w:p>
       <w:pPr>
         <w:keepNext/>
-        <w:spacing w:before="120" w:after="60"/>
+        <w:spacing w:before="100" w:after="40"/>
         <w:pBdr>
           <w:bottom w:val="single" w:sz="8" w:space="2" w:color="1B365D"/>
         </w:pBdr>
@@ -1908,7 +1443,7 @@
           <w:rFonts w:ascii="Calibri" w:hAnsi="Calibri"/>
           <w:b/>
           <w:color w:val="1B365D"/>
-          <w:sz w:val="22"/>
+          <w:sz w:val="21"/>
         </w:rPr>
         <w:t>EDUCATION</w:t>
       </w:r>
@@ -1937,12 +1472,12 @@
           </w:tcPr>
           <w:p>
             <w:pPr>
-              <w:spacing w:before="40" w:after="10"/>
+              <w:spacing w:before="30" w:after="10"/>
             </w:pPr>
             <w:r>
               <w:rPr>
                 <w:rFonts w:ascii="Calibri" w:hAnsi="Calibri"/>
-                <w:sz w:val="19"/>
+                <w:sz w:val="18"/>
               </w:rPr>
               <w:t xml:space="preserve">•  </w:t>
             </w:r>
@@ -1951,7 +1486,7 @@
                 <w:rFonts w:ascii="Calibri" w:hAnsi="Calibri"/>
                 <w:b/>
                 <w:color w:val="1B365D"/>
-                <w:sz w:val="19"/>
+                <w:sz w:val="18"/>
               </w:rPr>
               <w:t>Lovely Professional University</w:t>
             </w:r>
@@ -1969,14 +1504,14 @@
           </w:tcPr>
           <w:p>
             <w:pPr>
-              <w:spacing w:before="40" w:after="10"/>
+              <w:spacing w:before="30" w:after="10"/>
               <w:jc w:val="right"/>
             </w:pPr>
             <w:r>
               <w:rPr>
                 <w:rFonts w:ascii="Calibri" w:hAnsi="Calibri"/>
                 <w:color w:val="4B5563"/>
-                <w:sz w:val="19"/>
+                <w:sz w:val="18"/>
               </w:rPr>
               <w:t>Phagwara, Punjab</w:t>
             </w:r>
@@ -1996,14 +1531,14 @@
           </w:tcPr>
           <w:p>
             <w:pPr>
-              <w:spacing w:before="0" w:after="60"/>
+              <w:spacing w:before="0" w:after="40"/>
               <w:ind w:left="288"/>
             </w:pPr>
             <w:r>
               <w:rPr>
                 <w:rFonts w:ascii="Calibri" w:hAnsi="Calibri"/>
                 <w:color w:val="111827"/>
-                <w:sz w:val="19"/>
+                <w:sz w:val="18"/>
               </w:rPr>
               <w:t>Bachelor of Technology - Computer Science and Engineering; CGPA: 9.31</w:t>
             </w:r>
@@ -2021,16 +1556,16 @@
           </w:tcPr>
           <w:p>
             <w:pPr>
-              <w:spacing w:before="0" w:after="60"/>
+              <w:spacing w:before="0" w:after="40"/>
               <w:jc w:val="right"/>
             </w:pPr>
             <w:r>
               <w:rPr>
                 <w:rFonts w:ascii="Calibri" w:hAnsi="Calibri"/>
                 <w:color w:val="4B5563"/>
-                <w:sz w:val="19"/>
+                <w:sz w:val="18"/>
               </w:rPr>
-              <w:t>Aug 2024 - Present</w:t>
+              <w:t>Aug 2025 - Present</w:t>
             </w:r>
           </w:p>
         </w:tc>
@@ -2060,12 +1595,12 @@
           </w:tcPr>
           <w:p>
             <w:pPr>
-              <w:spacing w:before="40" w:after="10"/>
+              <w:spacing w:before="30" w:after="10"/>
             </w:pPr>
             <w:r>
               <w:rPr>
                 <w:rFonts w:ascii="Calibri" w:hAnsi="Calibri"/>
-                <w:sz w:val="19"/>
+                <w:sz w:val="18"/>
               </w:rPr>
               <w:t xml:space="preserve">•  </w:t>
             </w:r>
@@ -2074,7 +1609,7 @@
                 <w:rFonts w:ascii="Calibri" w:hAnsi="Calibri"/>
                 <w:b/>
                 <w:color w:val="1B365D"/>
-                <w:sz w:val="19"/>
+                <w:sz w:val="18"/>
               </w:rPr>
               <w:t>Bhai Mastan Singh Public School</w:t>
             </w:r>
@@ -2092,14 +1627,14 @@
           </w:tcPr>
           <w:p>
             <w:pPr>
-              <w:spacing w:before="40" w:after="10"/>
+              <w:spacing w:before="30" w:after="10"/>
               <w:jc w:val="right"/>
             </w:pPr>
             <w:r>
               <w:rPr>
                 <w:rFonts w:ascii="Calibri" w:hAnsi="Calibri"/>
                 <w:color w:val="4B5563"/>
-                <w:sz w:val="19"/>
+                <w:sz w:val="18"/>
               </w:rPr>
               <w:t>Muktsar, Punjab</w:t>
             </w:r>
@@ -2119,16 +1654,16 @@
           </w:tcPr>
           <w:p>
             <w:pPr>
-              <w:spacing w:before="0" w:after="60"/>
+              <w:spacing w:before="0" w:after="40"/>
               <w:ind w:left="288"/>
             </w:pPr>
             <w:r>
               <w:rPr>
                 <w:rFonts w:ascii="Calibri" w:hAnsi="Calibri"/>
                 <w:color w:val="111827"/>
-                <w:sz w:val="19"/>
+                <w:sz w:val="18"/>
               </w:rPr>
-              <w:t>Higher Secondary Education (12th); Percentage: 75.8%</w:t>
+              <w:t>Higher Secondary Education (12th); Percentage: 75.8</w:t>
             </w:r>
           </w:p>
         </w:tc>
@@ -2144,16 +1679,16 @@
           </w:tcPr>
           <w:p>
             <w:pPr>
-              <w:spacing w:before="0" w:after="60"/>
+              <w:spacing w:before="0" w:after="40"/>
               <w:jc w:val="right"/>
             </w:pPr>
             <w:r>
               <w:rPr>
                 <w:rFonts w:ascii="Calibri" w:hAnsi="Calibri"/>
                 <w:color w:val="4B5563"/>
-                <w:sz w:val="19"/>
+                <w:sz w:val="18"/>
               </w:rPr>
-              <w:t>May 2023 - Mar 2024</w:t>
+              <w:t>Mar 2024 - Mar 2025</w:t>
             </w:r>
           </w:p>
         </w:tc>
@@ -2183,12 +1718,12 @@
           </w:tcPr>
           <w:p>
             <w:pPr>
-              <w:spacing w:before="40" w:after="10"/>
+              <w:spacing w:before="30" w:after="10"/>
             </w:pPr>
             <w:r>
               <w:rPr>
                 <w:rFonts w:ascii="Calibri" w:hAnsi="Calibri"/>
-                <w:sz w:val="19"/>
+                <w:sz w:val="18"/>
               </w:rPr>
               <w:t xml:space="preserve">•  </w:t>
             </w:r>
@@ -2197,7 +1732,7 @@
                 <w:rFonts w:ascii="Calibri" w:hAnsi="Calibri"/>
                 <w:b/>
                 <w:color w:val="1B365D"/>
-                <w:sz w:val="19"/>
+                <w:sz w:val="18"/>
               </w:rPr>
               <w:t>D.A.V. Public School</w:t>
             </w:r>
@@ -2215,14 +1750,14 @@
           </w:tcPr>
           <w:p>
             <w:pPr>
-              <w:spacing w:before="40" w:after="10"/>
+              <w:spacing w:before="30" w:after="10"/>
               <w:jc w:val="right"/>
             </w:pPr>
             <w:r>
               <w:rPr>
                 <w:rFonts w:ascii="Calibri" w:hAnsi="Calibri"/>
                 <w:color w:val="4B5563"/>
-                <w:sz w:val="19"/>
+                <w:sz w:val="18"/>
               </w:rPr>
               <w:t>Muktsar, Punjab</w:t>
             </w:r>
@@ -2242,16 +1777,16 @@
           </w:tcPr>
           <w:p>
             <w:pPr>
-              <w:spacing w:before="0" w:after="60"/>
+              <w:spacing w:before="0" w:after="40"/>
               <w:ind w:left="288"/>
             </w:pPr>
             <w:r>
               <w:rPr>
                 <w:rFonts w:ascii="Calibri" w:hAnsi="Calibri"/>
                 <w:color w:val="111827"/>
-                <w:sz w:val="19"/>
+                <w:sz w:val="18"/>
               </w:rPr>
-              <w:t>Secondary Education (10th); Percentage: 90.6%</w:t>
+              <w:t>Secondary Education (10th); Percentage: 90.6</w:t>
             </w:r>
           </w:p>
         </w:tc>
@@ -2267,16 +1802,16 @@
           </w:tcPr>
           <w:p>
             <w:pPr>
-              <w:spacing w:before="0" w:after="60"/>
+              <w:spacing w:before="0" w:after="40"/>
               <w:jc w:val="right"/>
             </w:pPr>
             <w:r>
               <w:rPr>
                 <w:rFonts w:ascii="Calibri" w:hAnsi="Calibri"/>
                 <w:color w:val="4B5563"/>
-                <w:sz w:val="19"/>
+                <w:sz w:val="18"/>
               </w:rPr>
-              <w:t>Jun 2021 - Mar 2022</w:t>
+              <w:t>Mar 2022 - Mar 2023</w:t>
             </w:r>
           </w:p>
         </w:tc>

</xml_diff>